<commit_message>
feat: App constancias update 2.0
</commit_message>
<xml_diff>
--- a/public/plantilla/CONSTANCIAUP.docx
+++ b/public/plantilla/CONSTANCIAUP.docx
@@ -35,7 +35,7 @@
               <w:ind w:left="4248" w:hanging="4248"/>
               <w:jc w:val="center"/>
               <w:rPr>
-                <w:rFonts w:ascii="HelveticaNeueLT Std Lt" w:hAnsi="HelveticaNeueLT Std Lt"/>
+                <w:rFonts w:ascii="Arial" w:hAnsi="Arial" w:cs="Arial"/>
                 <w:b/>
                 <w:bCs/>
                 <w:color w:val="505050"/>
@@ -43,7 +43,7 @@
             </w:pPr>
             <w:r>
               <w:rPr>
-                <w:rFonts w:ascii="HelveticaNeueLT Std Lt" w:hAnsi="HelveticaNeueLT Std Lt"/>
+                <w:rFonts w:ascii="Arial" w:hAnsi="Arial" w:cs="Arial"/>
                 <w:b/>
                 <w:bCs/>
                 <w:color w:val="505050"/>
@@ -117,6 +117,15 @@
                 <w:szCs w:val="22"/>
               </w:rPr>
               <w:t>Con fundamento en los Artículos 14, Fracción IX y 35 del Reglamento del Servicio Social del Estado de México; se expide la presente en la ciudad típica de Valle de Bravo, Estado de México, {{FECHA_EMISION}}</w:t>
+            </w:r>
+            <w:r>
+              <w:rPr>
+                <w:rFonts w:ascii="HelveticaNeueLT Std Lt" w:hAnsi="HelveticaNeueLT Std Lt"/>
+                <w:color w:val="505050"/>
+                <w:sz w:val="22"/>
+                <w:szCs w:val="22"/>
+              </w:rPr>
+              <w:t>.</w:t>
             </w:r>
           </w:p>
           <w:p>
@@ -159,7 +168,7 @@
               <w:spacing w:before="0" w:beforeAutospacing="0" w:after="0" w:afterAutospacing="0"/>
               <w:jc w:val="center"/>
               <w:rPr>
-                <w:rFonts w:ascii="HelveticaNeueLT Std Lt" w:hAnsi="HelveticaNeueLT Std Lt" w:cstheme="minorBidi"/>
+                <w:rFonts w:ascii="Arial" w:hAnsi="Arial" w:cs="Arial"/>
                 <w:b/>
                 <w:bCs/>
                 <w:color w:val="404040" w:themeColor="text1" w:themeTint="BF"/>
@@ -170,7 +179,7 @@
             </w:pPr>
             <w:r>
               <w:rPr>
-                <w:rFonts w:ascii="HelveticaNeueLT Std Lt" w:hAnsi="HelveticaNeueLT Std Lt" w:cstheme="minorBidi"/>
+                <w:rFonts w:ascii="Arial" w:hAnsi="Arial" w:cs="Arial"/>
                 <w:b/>
                 <w:bCs/>
                 <w:color w:val="404040" w:themeColor="text1" w:themeTint="BF"/>
@@ -187,13 +196,13 @@
               <w:spacing w:before="0" w:beforeAutospacing="0" w:after="0" w:afterAutospacing="0"/>
               <w:jc w:val="center"/>
               <w:rPr>
-                <w:rFonts w:ascii="HelveticaNeueLT Std Lt" w:hAnsi="HelveticaNeueLT Std Lt"/>
+                <w:rFonts w:ascii="Arial" w:hAnsi="Arial" w:cs="Arial"/>
                 <w:lang w:val="es-ES"/>
               </w:rPr>
             </w:pPr>
             <w:r>
               <w:rPr>
-                <w:rFonts w:ascii="HelveticaNeueLT Std Lt" w:hAnsi="HelveticaNeueLT Std Lt" w:cstheme="minorBidi"/>
+                <w:rFonts w:ascii="Arial" w:hAnsi="Arial" w:cs="Arial"/>
                 <w:b/>
                 <w:bCs/>
                 <w:color w:val="404040" w:themeColor="text1" w:themeTint="BF"/>
@@ -250,7 +259,7 @@
               <w:pStyle w:val="NormalWeb"/>
               <w:spacing w:before="0" w:beforeAutospacing="0" w:after="0" w:afterAutospacing="0"/>
               <w:rPr>
-                <w:rFonts w:ascii="HelveticaNeueLT Std Lt" w:hAnsi="HelveticaNeueLT Std Lt" w:cstheme="minorBidi"/>
+                <w:rFonts w:ascii="Arial" w:hAnsi="Arial" w:cs="Arial"/>
                 <w:b/>
                 <w:bCs/>
                 <w:color w:val="595959" w:themeColor="text1" w:themeTint="A6"/>
@@ -260,7 +269,7 @@
             </w:pPr>
             <w:r>
               <w:rPr>
-                <w:rFonts w:ascii="HelveticaNeueLT Std Lt" w:hAnsi="HelveticaNeueLT Std Lt"/>
+                <w:rFonts w:ascii="Arial" w:hAnsi="Arial" w:cs="Arial"/>
                 <w:b/>
                 <w:bCs/>
                 <w:noProof/>

</xml_diff>